<commit_message>
Relevance of genres Part 2 and GenAi usage (log(followers) suggestion).
Relevance of genres Part 2 got finished and added GenAi usage (log(followers) suggestion) to the word document.
</commit_message>
<xml_diff>
--- a/Evaluation of Cooperation and usage of GenAI.docx
+++ b/Evaluation of Cooperation and usage of GenAI.docx
@@ -678,12 +678,12 @@
         <w:tblLook w:val="04A0" w:firstRow="1" w:lastRow="0" w:firstColumn="1" w:lastColumn="0" w:noHBand="0" w:noVBand="1"/>
       </w:tblPr>
       <w:tblGrid>
-        <w:gridCol w:w="1018"/>
-        <w:gridCol w:w="1192"/>
-        <w:gridCol w:w="1412"/>
-        <w:gridCol w:w="2373"/>
-        <w:gridCol w:w="2341"/>
-        <w:gridCol w:w="2120"/>
+        <w:gridCol w:w="1278"/>
+        <w:gridCol w:w="1154"/>
+        <w:gridCol w:w="1363"/>
+        <w:gridCol w:w="2308"/>
+        <w:gridCol w:w="2287"/>
+        <w:gridCol w:w="2066"/>
       </w:tblGrid>
       <w:tr>
         <w:trPr>
@@ -865,6 +865,12 @@
                 <w:color w:val="2F5496" w:themeColor="accent1" w:themeShade="BF"/>
               </w:rPr>
             </w:pPr>
+            <w:r>
+              <w:rPr>
+                <w:color w:val="2F5496" w:themeColor="accent1" w:themeShade="BF"/>
+              </w:rPr>
+              <w:t>15/02/2026</w:t>
+            </w:r>
           </w:p>
         </w:tc>
         <w:tc>
@@ -872,73 +878,170 @@
             <w:tcW w:w="1192" w:type="dxa"/>
             <w:vAlign w:val="center"/>
           </w:tcPr>
+          <w:p>
+            <w:r>
+              <w:t xml:space="preserve">Chat </w:t>
+            </w:r>
+            <w:proofErr w:type="spellStart"/>
+            <w:r>
+              <w:t>gpt</w:t>
+            </w:r>
+            <w:proofErr w:type="spellEnd"/>
+          </w:p>
+        </w:tc>
+        <w:tc>
+          <w:tcPr>
+            <w:tcW w:w="1412" w:type="dxa"/>
+          </w:tcPr>
+          <w:p>
+            <w:r>
+              <w:t xml:space="preserve">- </w:t>
+            </w:r>
+            <w:r>
+              <w:rPr>
+                <w:color w:val="2F5496" w:themeColor="accent1" w:themeShade="BF"/>
+              </w:rPr>
+              <w:t>…</w:t>
+            </w:r>
+          </w:p>
+          <w:p>
+            <w:r>
+              <w:t xml:space="preserve">- </w:t>
+            </w:r>
+            <w:r>
+              <w:rPr>
+                <w:color w:val="2F5496" w:themeColor="accent1" w:themeShade="BF"/>
+              </w:rPr>
+              <w:t>…</w:t>
+            </w:r>
+          </w:p>
+          <w:p>
+            <w:r>
+              <w:t xml:space="preserve">- </w:t>
+            </w:r>
+            <w:r>
+              <w:rPr>
+                <w:color w:val="2F5496" w:themeColor="accent1" w:themeShade="BF"/>
+              </w:rPr>
+              <w:t>…</w:t>
+            </w:r>
+          </w:p>
+          <w:p>
+            <w:r>
+              <w:t xml:space="preserve">- </w:t>
+            </w:r>
+            <w:r>
+              <w:rPr>
+                <w:color w:val="2F5496" w:themeColor="accent1" w:themeShade="BF"/>
+              </w:rPr>
+              <w:t>…</w:t>
+            </w:r>
+          </w:p>
+        </w:tc>
+        <w:tc>
+          <w:tcPr>
+            <w:tcW w:w="2373" w:type="dxa"/>
+          </w:tcPr>
+          <w:p>
+            <w:r>
+              <w:t xml:space="preserve">Why is there that the </w:t>
+            </w:r>
+            <w:proofErr w:type="spellStart"/>
+            <w:r>
+              <w:t>corralation</w:t>
+            </w:r>
+            <w:proofErr w:type="spellEnd"/>
+            <w:r>
+              <w:t xml:space="preserve"> between followers and </w:t>
+            </w:r>
+            <w:proofErr w:type="spellStart"/>
+            <w:r>
+              <w:t>numb</w:t>
+            </w:r>
+            <w:r>
+              <w:t>_</w:t>
+            </w:r>
+            <w:r>
+              <w:t>genres</w:t>
+            </w:r>
+            <w:proofErr w:type="spellEnd"/>
+            <w:r>
+              <w:t xml:space="preserve"> and popularity is so low? Do I have to </w:t>
+            </w:r>
+            <w:proofErr w:type="spellStart"/>
+            <w:r>
+              <w:t>modifiy</w:t>
+            </w:r>
+            <w:proofErr w:type="spellEnd"/>
+            <w:r>
+              <w:t xml:space="preserve"> the data if </w:t>
+            </w:r>
+            <w:proofErr w:type="gramStart"/>
+            <w:r>
+              <w:t>so</w:t>
+            </w:r>
+            <w:proofErr w:type="gramEnd"/>
+            <w:r>
+              <w:t xml:space="preserve"> why?</w:t>
+            </w:r>
+          </w:p>
+        </w:tc>
+        <w:tc>
+          <w:tcPr>
+            <w:tcW w:w="2341" w:type="dxa"/>
+          </w:tcPr>
+          <w:p>
+            <w:r>
+              <w:t>It suggested me the following: “</w:t>
+            </w:r>
+            <w:r>
+              <w:t>Correlation on the raw scale gets distorted.</w:t>
+            </w:r>
+            <w:r>
+              <w:t xml:space="preserve"> </w:t>
+            </w:r>
+            <w:r>
+              <w:t>Fix</w:t>
+            </w:r>
+            <w:r>
+              <w:t xml:space="preserve">: </w:t>
+            </w:r>
+            <w:r>
+              <w:t>use log scale</w:t>
+            </w:r>
+            <w:r>
+              <w:br/>
+              <w:t xml:space="preserve">Try correlating popularity with </w:t>
+            </w:r>
+            <w:proofErr w:type="spellStart"/>
+            <w:r>
+              <w:t>log</w:t>
+            </w:r>
+            <w:r>
+              <w:t>_</w:t>
+            </w:r>
+            <w:r>
+              <w:t>followers</w:t>
+            </w:r>
+            <w:proofErr w:type="spellEnd"/>
+            <w:r>
+              <w:t>.</w:t>
+            </w:r>
+            <w:r>
+              <w:t>”</w:t>
+            </w:r>
+          </w:p>
           <w:p/>
         </w:tc>
         <w:tc>
           <w:tcPr>
-            <w:tcW w:w="1412" w:type="dxa"/>
-          </w:tcPr>
-          <w:p>
-            <w:r>
-              <w:t xml:space="preserve">- </w:t>
-            </w:r>
-            <w:r>
-              <w:rPr>
-                <w:color w:val="2F5496" w:themeColor="accent1" w:themeShade="BF"/>
-              </w:rPr>
-              <w:t>…</w:t>
-            </w:r>
-          </w:p>
-          <w:p>
-            <w:r>
-              <w:t xml:space="preserve">- </w:t>
-            </w:r>
-            <w:r>
-              <w:rPr>
-                <w:color w:val="2F5496" w:themeColor="accent1" w:themeShade="BF"/>
-              </w:rPr>
-              <w:t>…</w:t>
-            </w:r>
-          </w:p>
-          <w:p>
-            <w:r>
-              <w:t xml:space="preserve">- </w:t>
-            </w:r>
-            <w:r>
-              <w:rPr>
-                <w:color w:val="2F5496" w:themeColor="accent1" w:themeShade="BF"/>
-              </w:rPr>
-              <w:t>…</w:t>
-            </w:r>
-          </w:p>
-          <w:p>
-            <w:r>
-              <w:t xml:space="preserve">- </w:t>
-            </w:r>
-            <w:r>
-              <w:rPr>
-                <w:color w:val="2F5496" w:themeColor="accent1" w:themeShade="BF"/>
-              </w:rPr>
-              <w:t>…</w:t>
-            </w:r>
-          </w:p>
-        </w:tc>
-        <w:tc>
-          <w:tcPr>
-            <w:tcW w:w="2373" w:type="dxa"/>
-          </w:tcPr>
-          <w:p/>
-        </w:tc>
-        <w:tc>
-          <w:tcPr>
-            <w:tcW w:w="2341" w:type="dxa"/>
-          </w:tcPr>
-          <w:p/>
-        </w:tc>
-        <w:tc>
-          <w:tcPr>
             <w:tcW w:w="2120" w:type="dxa"/>
           </w:tcPr>
+          <w:p>
+            <w:r>
+              <w:t>The correlation matrix seemed more reasonable.</w:t>
+            </w:r>
+          </w:p>
           <w:p/>
         </w:tc>
       </w:tr>
@@ -2102,7 +2205,6 @@
   <w:style w:type="character" w:default="1" w:styleId="DefaultParagraphFont">
     <w:name w:val="Default Paragraph Font"/>
     <w:uiPriority w:val="1"/>
-    <w:semiHidden/>
     <w:unhideWhenUsed/>
   </w:style>
   <w:style w:type="table" w:default="1" w:styleId="TableNormal">
@@ -2202,6 +2304,19 @@
       <w:ind w:left="720"/>
       <w:contextualSpacing/>
     </w:pPr>
+  </w:style>
+  <w:style w:type="paragraph" w:styleId="NormalWeb">
+    <w:name w:val="Normal (Web)"/>
+    <w:basedOn w:val="Normal"/>
+    <w:uiPriority w:val="99"/>
+    <w:semiHidden/>
+    <w:unhideWhenUsed/>
+    <w:rsid w:val="00351031"/>
+    <w:rPr>
+      <w:rFonts w:ascii="Times New Roman" w:hAnsi="Times New Roman" w:cs="Times New Roman"/>
+      <w:sz w:val="24"/>
+      <w:szCs w:val="24"/>
+    </w:rPr>
   </w:style>
 </w:styles>
 </file>

</xml_diff>

<commit_message>
update on AI Usage
</commit_message>
<xml_diff>
--- a/Evaluation of Cooperation and usage of GenAI.docx
+++ b/Evaluation of Cooperation and usage of GenAI.docx
@@ -678,12 +678,12 @@
         <w:tblLook w:val="04A0" w:firstRow="1" w:lastRow="0" w:firstColumn="1" w:lastColumn="0" w:noHBand="0" w:noVBand="1"/>
       </w:tblPr>
       <w:tblGrid>
-        <w:gridCol w:w="1278"/>
-        <w:gridCol w:w="1154"/>
-        <w:gridCol w:w="1363"/>
-        <w:gridCol w:w="2308"/>
-        <w:gridCol w:w="2287"/>
-        <w:gridCol w:w="2066"/>
+        <w:gridCol w:w="1279"/>
+        <w:gridCol w:w="988"/>
+        <w:gridCol w:w="1944"/>
+        <w:gridCol w:w="2162"/>
+        <w:gridCol w:w="2152"/>
+        <w:gridCol w:w="1931"/>
       </w:tblGrid>
       <w:tr>
         <w:trPr>
@@ -691,7 +691,7 @@
         </w:trPr>
         <w:tc>
           <w:tcPr>
-            <w:tcW w:w="1018" w:type="dxa"/>
+            <w:tcW w:w="1279" w:type="dxa"/>
             <w:shd w:val="clear" w:color="auto" w:fill="D9E2F3" w:themeFill="accent1" w:themeFillTint="33"/>
           </w:tcPr>
           <w:p>
@@ -712,7 +712,7 @@
         </w:tc>
         <w:tc>
           <w:tcPr>
-            <w:tcW w:w="1192" w:type="dxa"/>
+            <w:tcW w:w="984" w:type="dxa"/>
             <w:shd w:val="clear" w:color="auto" w:fill="FFF2CC" w:themeFill="accent4" w:themeFillTint="33"/>
           </w:tcPr>
           <w:p>
@@ -733,7 +733,7 @@
         </w:tc>
         <w:tc>
           <w:tcPr>
-            <w:tcW w:w="1412" w:type="dxa"/>
+            <w:tcW w:w="1944" w:type="dxa"/>
             <w:shd w:val="clear" w:color="auto" w:fill="FFF2CC" w:themeFill="accent4" w:themeFillTint="33"/>
           </w:tcPr>
           <w:p>
@@ -768,7 +768,7 @@
         </w:tc>
         <w:tc>
           <w:tcPr>
-            <w:tcW w:w="2373" w:type="dxa"/>
+            <w:tcW w:w="2163" w:type="dxa"/>
             <w:shd w:val="clear" w:color="auto" w:fill="FFF2CC" w:themeFill="accent4" w:themeFillTint="33"/>
           </w:tcPr>
           <w:p>
@@ -789,7 +789,7 @@
         </w:tc>
         <w:tc>
           <w:tcPr>
-            <w:tcW w:w="2341" w:type="dxa"/>
+            <w:tcW w:w="2153" w:type="dxa"/>
             <w:shd w:val="clear" w:color="auto" w:fill="FFF2CC" w:themeFill="accent4" w:themeFillTint="33"/>
           </w:tcPr>
           <w:p>
@@ -823,7 +823,7 @@
         </w:tc>
         <w:tc>
           <w:tcPr>
-            <w:tcW w:w="2120" w:type="dxa"/>
+            <w:tcW w:w="1933" w:type="dxa"/>
             <w:shd w:val="clear" w:color="auto" w:fill="FFF2CC" w:themeFill="accent4" w:themeFillTint="33"/>
           </w:tcPr>
           <w:p>
@@ -854,7 +854,7 @@
         </w:trPr>
         <w:tc>
           <w:tcPr>
-            <w:tcW w:w="1018" w:type="dxa"/>
+            <w:tcW w:w="1279" w:type="dxa"/>
             <w:shd w:val="clear" w:color="auto" w:fill="E2EFD9" w:themeFill="accent6" w:themeFillTint="33"/>
             <w:vAlign w:val="center"/>
           </w:tcPr>
@@ -875,7 +875,7 @@
         </w:tc>
         <w:tc>
           <w:tcPr>
-            <w:tcW w:w="1192" w:type="dxa"/>
+            <w:tcW w:w="984" w:type="dxa"/>
             <w:vAlign w:val="center"/>
           </w:tcPr>
           <w:p>
@@ -891,56 +891,56 @@
         </w:tc>
         <w:tc>
           <w:tcPr>
-            <w:tcW w:w="1412" w:type="dxa"/>
-          </w:tcPr>
-          <w:p>
-            <w:r>
-              <w:t xml:space="preserve">- </w:t>
-            </w:r>
-            <w:r>
-              <w:rPr>
-                <w:color w:val="2F5496" w:themeColor="accent1" w:themeShade="BF"/>
-              </w:rPr>
-              <w:t>…</w:t>
-            </w:r>
-          </w:p>
-          <w:p>
-            <w:r>
-              <w:t xml:space="preserve">- </w:t>
-            </w:r>
-            <w:r>
-              <w:rPr>
-                <w:color w:val="2F5496" w:themeColor="accent1" w:themeShade="BF"/>
-              </w:rPr>
-              <w:t>…</w:t>
-            </w:r>
-          </w:p>
-          <w:p>
-            <w:r>
-              <w:t xml:space="preserve">- </w:t>
-            </w:r>
-            <w:r>
-              <w:rPr>
-                <w:color w:val="2F5496" w:themeColor="accent1" w:themeShade="BF"/>
-              </w:rPr>
-              <w:t>…</w:t>
-            </w:r>
-          </w:p>
-          <w:p>
-            <w:r>
-              <w:t xml:space="preserve">- </w:t>
-            </w:r>
-            <w:r>
-              <w:rPr>
-                <w:color w:val="2F5496" w:themeColor="accent1" w:themeShade="BF"/>
-              </w:rPr>
-              <w:t>…</w:t>
-            </w:r>
-          </w:p>
-        </w:tc>
-        <w:tc>
-          <w:tcPr>
-            <w:tcW w:w="2373" w:type="dxa"/>
+            <w:tcW w:w="1944" w:type="dxa"/>
+          </w:tcPr>
+          <w:p>
+            <w:r>
+              <w:t xml:space="preserve">- </w:t>
+            </w:r>
+            <w:r>
+              <w:rPr>
+                <w:color w:val="2F5496" w:themeColor="accent1" w:themeShade="BF"/>
+              </w:rPr>
+              <w:t>…</w:t>
+            </w:r>
+          </w:p>
+          <w:p>
+            <w:r>
+              <w:t xml:space="preserve">- </w:t>
+            </w:r>
+            <w:r>
+              <w:rPr>
+                <w:color w:val="2F5496" w:themeColor="accent1" w:themeShade="BF"/>
+              </w:rPr>
+              <w:t>…</w:t>
+            </w:r>
+          </w:p>
+          <w:p>
+            <w:r>
+              <w:t xml:space="preserve">- </w:t>
+            </w:r>
+            <w:r>
+              <w:rPr>
+                <w:color w:val="2F5496" w:themeColor="accent1" w:themeShade="BF"/>
+              </w:rPr>
+              <w:t>…</w:t>
+            </w:r>
+          </w:p>
+          <w:p>
+            <w:r>
+              <w:t xml:space="preserve">- </w:t>
+            </w:r>
+            <w:r>
+              <w:rPr>
+                <w:color w:val="2F5496" w:themeColor="accent1" w:themeShade="BF"/>
+              </w:rPr>
+              <w:t>…</w:t>
+            </w:r>
+          </w:p>
+        </w:tc>
+        <w:tc>
+          <w:tcPr>
+            <w:tcW w:w="2163" w:type="dxa"/>
           </w:tcPr>
           <w:p>
             <w:r>
@@ -988,7 +988,7 @@
         </w:tc>
         <w:tc>
           <w:tcPr>
-            <w:tcW w:w="2341" w:type="dxa"/>
+            <w:tcW w:w="2153" w:type="dxa"/>
           </w:tcPr>
           <w:p>
             <w:r>
@@ -1035,7 +1035,7 @@
         </w:tc>
         <w:tc>
           <w:tcPr>
-            <w:tcW w:w="2120" w:type="dxa"/>
+            <w:tcW w:w="1933" w:type="dxa"/>
           </w:tcPr>
           <w:p>
             <w:r>
@@ -1051,7 +1051,7 @@
         </w:trPr>
         <w:tc>
           <w:tcPr>
-            <w:tcW w:w="1018" w:type="dxa"/>
+            <w:tcW w:w="1279" w:type="dxa"/>
             <w:shd w:val="clear" w:color="auto" w:fill="E2EFD9" w:themeFill="accent6" w:themeFillTint="33"/>
             <w:vAlign w:val="center"/>
           </w:tcPr>
@@ -1059,85 +1059,155 @@
             <w:pPr>
               <w:jc w:val="center"/>
             </w:pPr>
-          </w:p>
-        </w:tc>
-        <w:tc>
-          <w:tcPr>
-            <w:tcW w:w="1192" w:type="dxa"/>
+            <w:r>
+              <w:t>16/02/1026</w:t>
+            </w:r>
+          </w:p>
+        </w:tc>
+        <w:tc>
+          <w:tcPr>
+            <w:tcW w:w="984" w:type="dxa"/>
             <w:vAlign w:val="center"/>
           </w:tcPr>
           <w:p>
             <w:pPr>
               <w:jc w:val="center"/>
             </w:pPr>
-          </w:p>
-        </w:tc>
-        <w:tc>
-          <w:tcPr>
-            <w:tcW w:w="1412" w:type="dxa"/>
-          </w:tcPr>
-          <w:p>
-            <w:r>
-              <w:t xml:space="preserve">- </w:t>
-            </w:r>
-            <w:r>
-              <w:rPr>
-                <w:color w:val="2F5496" w:themeColor="accent1" w:themeShade="BF"/>
-              </w:rPr>
-              <w:t>…</w:t>
-            </w:r>
-          </w:p>
-          <w:p>
-            <w:r>
-              <w:t xml:space="preserve">- </w:t>
-            </w:r>
-            <w:r>
-              <w:rPr>
-                <w:color w:val="2F5496" w:themeColor="accent1" w:themeShade="BF"/>
-              </w:rPr>
-              <w:t>…</w:t>
-            </w:r>
-          </w:p>
-          <w:p>
-            <w:r>
-              <w:t xml:space="preserve">- </w:t>
-            </w:r>
-            <w:r>
-              <w:rPr>
-                <w:color w:val="2F5496" w:themeColor="accent1" w:themeShade="BF"/>
-              </w:rPr>
-              <w:t>…</w:t>
-            </w:r>
-          </w:p>
-          <w:p>
-            <w:r>
-              <w:t xml:space="preserve">- </w:t>
-            </w:r>
-            <w:r>
-              <w:rPr>
-                <w:color w:val="2F5496" w:themeColor="accent1" w:themeShade="BF"/>
-              </w:rPr>
-              <w:t>…</w:t>
-            </w:r>
-          </w:p>
-        </w:tc>
-        <w:tc>
-          <w:tcPr>
-            <w:tcW w:w="2373" w:type="dxa"/>
-          </w:tcPr>
-          <w:p/>
-        </w:tc>
-        <w:tc>
-          <w:tcPr>
-            <w:tcW w:w="2341" w:type="dxa"/>
-          </w:tcPr>
-          <w:p/>
-        </w:tc>
-        <w:tc>
-          <w:tcPr>
-            <w:tcW w:w="2120" w:type="dxa"/>
-          </w:tcPr>
-          <w:p/>
+            <w:r>
+              <w:t>ChatGPT</w:t>
+            </w:r>
+          </w:p>
+        </w:tc>
+        <w:tc>
+          <w:tcPr>
+            <w:tcW w:w="1944" w:type="dxa"/>
+          </w:tcPr>
+          <w:p>
+            <w:r>
+              <w:t>-</w:t>
+            </w:r>
+            <w:proofErr w:type="spellStart"/>
+            <w:r>
+              <w:t>filtered_df_genre</w:t>
+            </w:r>
+            <w:proofErr w:type="spellEnd"/>
+          </w:p>
+          <w:p>
+            <w:r>
+              <w:t>(part_1.py)</w:t>
+            </w:r>
+          </w:p>
+          <w:p>
+            <w:r>
+              <w:t xml:space="preserve">- </w:t>
+            </w:r>
+            <w:proofErr w:type="spellStart"/>
+            <w:r>
+              <w:t>similarity_check</w:t>
+            </w:r>
+            <w:proofErr w:type="spellEnd"/>
+          </w:p>
+          <w:p>
+            <w:r>
+              <w:t xml:space="preserve">- </w:t>
+            </w:r>
+            <w:r>
+              <w:rPr>
+                <w:color w:val="2F5496" w:themeColor="accent1" w:themeShade="BF"/>
+              </w:rPr>
+              <w:t>…</w:t>
+            </w:r>
+          </w:p>
+        </w:tc>
+        <w:tc>
+          <w:tcPr>
+            <w:tcW w:w="2163" w:type="dxa"/>
+          </w:tcPr>
+          <w:p>
+            <w:r>
+              <w:t xml:space="preserve">Asked for help with figuring out a way to check part of strings in a whole string; for revision of visualisation via </w:t>
+            </w:r>
+            <w:proofErr w:type="spellStart"/>
+            <w:r>
+              <w:t>mathplotlib</w:t>
+            </w:r>
+            <w:proofErr w:type="spellEnd"/>
+            <w:r>
+              <w:t xml:space="preserve">; for recommendations to check similar names upon and for help with the </w:t>
+            </w:r>
+            <w:r>
+              <w:t>formulation</w:t>
+            </w:r>
+            <w:r>
+              <w:t xml:space="preserve"> </w:t>
+            </w:r>
+            <w:r>
+              <w:t xml:space="preserve">of the names to </w:t>
+            </w:r>
+            <w:proofErr w:type="spellStart"/>
+            <w:r>
+              <w:t>chek</w:t>
+            </w:r>
+            <w:proofErr w:type="spellEnd"/>
+            <w:r>
+              <w:t>.</w:t>
+            </w:r>
+          </w:p>
+        </w:tc>
+        <w:tc>
+          <w:tcPr>
+            <w:tcW w:w="2153" w:type="dxa"/>
+          </w:tcPr>
+          <w:p>
+            <w:r>
+              <w:t xml:space="preserve">I was </w:t>
+            </w:r>
+            <w:proofErr w:type="spellStart"/>
+            <w:r>
+              <w:t>adviced</w:t>
+            </w:r>
+            <w:proofErr w:type="spellEnd"/>
+            <w:r>
+              <w:t xml:space="preserve"> on using </w:t>
+            </w:r>
+            <w:r>
+              <w:t>.</w:t>
+            </w:r>
+            <w:proofErr w:type="spellStart"/>
+            <w:proofErr w:type="gramStart"/>
+            <w:r>
+              <w:t>str.contains</w:t>
+            </w:r>
+            <w:proofErr w:type="spellEnd"/>
+            <w:proofErr w:type="gramEnd"/>
+            <w:r>
+              <w:t>,</w:t>
+            </w:r>
+            <w:r>
+              <w:t xml:space="preserve"> </w:t>
+            </w:r>
+            <w:r>
+              <w:t xml:space="preserve">and </w:t>
+            </w:r>
+            <w:proofErr w:type="spellStart"/>
+            <w:r>
+              <w:t>SequenceMatcher</w:t>
+            </w:r>
+            <w:proofErr w:type="spellEnd"/>
+            <w:r>
+              <w:t xml:space="preserve"> for name similarities and given basic usage of the method, which I used as a starting point.</w:t>
+            </w:r>
+          </w:p>
+        </w:tc>
+        <w:tc>
+          <w:tcPr>
+            <w:tcW w:w="1933" w:type="dxa"/>
+          </w:tcPr>
+          <w:p>
+            <w:r>
+              <w:t>I tried out my code and inspected myself.</w:t>
+            </w:r>
+          </w:p>
         </w:tc>
       </w:tr>
       <w:tr>
@@ -1146,7 +1216,7 @@
         </w:trPr>
         <w:tc>
           <w:tcPr>
-            <w:tcW w:w="1018" w:type="dxa"/>
+            <w:tcW w:w="1279" w:type="dxa"/>
             <w:shd w:val="clear" w:color="auto" w:fill="E2EFD9" w:themeFill="accent6" w:themeFillTint="33"/>
             <w:vAlign w:val="center"/>
           </w:tcPr>
@@ -1154,85 +1224,103 @@
             <w:pPr>
               <w:jc w:val="center"/>
             </w:pPr>
-          </w:p>
-        </w:tc>
-        <w:tc>
-          <w:tcPr>
-            <w:tcW w:w="1192" w:type="dxa"/>
+            <w:r>
+              <w:t>20/02/2026</w:t>
+            </w:r>
+          </w:p>
+        </w:tc>
+        <w:tc>
+          <w:tcPr>
+            <w:tcW w:w="984" w:type="dxa"/>
             <w:vAlign w:val="center"/>
           </w:tcPr>
           <w:p>
             <w:pPr>
               <w:jc w:val="center"/>
             </w:pPr>
-          </w:p>
-        </w:tc>
-        <w:tc>
-          <w:tcPr>
-            <w:tcW w:w="1412" w:type="dxa"/>
-          </w:tcPr>
-          <w:p>
-            <w:r>
-              <w:t xml:space="preserve">- </w:t>
-            </w:r>
-            <w:r>
-              <w:rPr>
-                <w:color w:val="2F5496" w:themeColor="accent1" w:themeShade="BF"/>
-              </w:rPr>
-              <w:t>…</w:t>
-            </w:r>
-          </w:p>
-          <w:p>
-            <w:r>
-              <w:t xml:space="preserve">- </w:t>
-            </w:r>
-            <w:r>
-              <w:rPr>
-                <w:color w:val="2F5496" w:themeColor="accent1" w:themeShade="BF"/>
-              </w:rPr>
-              <w:t>…</w:t>
-            </w:r>
-          </w:p>
-          <w:p>
-            <w:r>
-              <w:t xml:space="preserve">- </w:t>
-            </w:r>
-            <w:r>
-              <w:rPr>
-                <w:color w:val="2F5496" w:themeColor="accent1" w:themeShade="BF"/>
-              </w:rPr>
-              <w:t>…</w:t>
-            </w:r>
-          </w:p>
-          <w:p>
-            <w:r>
-              <w:t xml:space="preserve">- </w:t>
-            </w:r>
-            <w:r>
-              <w:rPr>
-                <w:color w:val="2F5496" w:themeColor="accent1" w:themeShade="BF"/>
-              </w:rPr>
-              <w:t>…</w:t>
-            </w:r>
-          </w:p>
-        </w:tc>
-        <w:tc>
-          <w:tcPr>
-            <w:tcW w:w="2373" w:type="dxa"/>
-          </w:tcPr>
-          <w:p/>
-        </w:tc>
-        <w:tc>
-          <w:tcPr>
-            <w:tcW w:w="2341" w:type="dxa"/>
-          </w:tcPr>
-          <w:p/>
-        </w:tc>
-        <w:tc>
-          <w:tcPr>
-            <w:tcW w:w="2120" w:type="dxa"/>
-          </w:tcPr>
-          <w:p/>
+            <w:r>
+              <w:t>ChatGPT</w:t>
+            </w:r>
+          </w:p>
+        </w:tc>
+        <w:tc>
+          <w:tcPr>
+            <w:tcW w:w="1944" w:type="dxa"/>
+          </w:tcPr>
+          <w:p>
+            <w:r>
+              <w:t xml:space="preserve">- </w:t>
+            </w:r>
+            <w:r>
+              <w:t>part_3.py</w:t>
+            </w:r>
+          </w:p>
+          <w:p>
+            <w:r>
+              <w:t xml:space="preserve">- </w:t>
+            </w:r>
+            <w:r>
+              <w:rPr>
+                <w:color w:val="2F5496" w:themeColor="accent1" w:themeShade="BF"/>
+              </w:rPr>
+              <w:t>…</w:t>
+            </w:r>
+          </w:p>
+          <w:p>
+            <w:r>
+              <w:t xml:space="preserve">- </w:t>
+            </w:r>
+            <w:r>
+              <w:rPr>
+                <w:color w:val="2F5496" w:themeColor="accent1" w:themeShade="BF"/>
+              </w:rPr>
+              <w:t>…</w:t>
+            </w:r>
+          </w:p>
+          <w:p>
+            <w:r>
+              <w:t xml:space="preserve">- </w:t>
+            </w:r>
+            <w:r>
+              <w:rPr>
+                <w:color w:val="2F5496" w:themeColor="accent1" w:themeShade="BF"/>
+              </w:rPr>
+              <w:t>…</w:t>
+            </w:r>
+          </w:p>
+        </w:tc>
+        <w:tc>
+          <w:tcPr>
+            <w:tcW w:w="2163" w:type="dxa"/>
+          </w:tcPr>
+          <w:p>
+            <w:r>
+              <w:t xml:space="preserve">I asked </w:t>
+            </w:r>
+            <w:r>
+              <w:t>about revising and improving SQLite database structure and queries — including adjusting primary and foreign keys, inspecting constraints, refining JOIN logic and related SQL statements, and understanding when to perform data processing in SQL versus Python for better performance.</w:t>
+            </w:r>
+          </w:p>
+        </w:tc>
+        <w:tc>
+          <w:tcPr>
+            <w:tcW w:w="2153" w:type="dxa"/>
+          </w:tcPr>
+          <w:p>
+            <w:r>
+              <w:t xml:space="preserve">I used most output as a refreshment for the mobility and functionality of data bases. </w:t>
+            </w:r>
+          </w:p>
+        </w:tc>
+        <w:tc>
+          <w:tcPr>
+            <w:tcW w:w="1933" w:type="dxa"/>
+          </w:tcPr>
+          <w:p>
+            <w:r>
+              <w:t>I compared with notes from my previous databases courses and by inspecting the code myself.</w:t>
+            </w:r>
+          </w:p>
         </w:tc>
       </w:tr>
       <w:tr>
@@ -1241,7 +1329,7 @@
         </w:trPr>
         <w:tc>
           <w:tcPr>
-            <w:tcW w:w="1018" w:type="dxa"/>
+            <w:tcW w:w="1279" w:type="dxa"/>
             <w:shd w:val="clear" w:color="auto" w:fill="E2EFD9" w:themeFill="accent6" w:themeFillTint="33"/>
             <w:vAlign w:val="center"/>
           </w:tcPr>
@@ -1256,7 +1344,7 @@
         </w:tc>
         <w:tc>
           <w:tcPr>
-            <w:tcW w:w="1192" w:type="dxa"/>
+            <w:tcW w:w="984" w:type="dxa"/>
             <w:vAlign w:val="center"/>
           </w:tcPr>
           <w:p>
@@ -1270,68 +1358,68 @@
         </w:tc>
         <w:tc>
           <w:tcPr>
-            <w:tcW w:w="1412" w:type="dxa"/>
-          </w:tcPr>
-          <w:p>
-            <w:r>
-              <w:t xml:space="preserve">- </w:t>
-            </w:r>
-            <w:r>
-              <w:rPr>
-                <w:color w:val="2F5496" w:themeColor="accent1" w:themeShade="BF"/>
-              </w:rPr>
-              <w:t>…</w:t>
-            </w:r>
-          </w:p>
-          <w:p>
-            <w:r>
-              <w:t xml:space="preserve">- </w:t>
-            </w:r>
-            <w:r>
-              <w:rPr>
-                <w:color w:val="2F5496" w:themeColor="accent1" w:themeShade="BF"/>
-              </w:rPr>
-              <w:t>…</w:t>
-            </w:r>
-          </w:p>
-          <w:p>
-            <w:r>
-              <w:t xml:space="preserve">- </w:t>
-            </w:r>
-            <w:r>
-              <w:rPr>
-                <w:color w:val="2F5496" w:themeColor="accent1" w:themeShade="BF"/>
-              </w:rPr>
-              <w:t>…</w:t>
-            </w:r>
-          </w:p>
-          <w:p>
-            <w:r>
-              <w:t xml:space="preserve">- </w:t>
-            </w:r>
-            <w:r>
-              <w:rPr>
-                <w:color w:val="2F5496" w:themeColor="accent1" w:themeShade="BF"/>
-              </w:rPr>
-              <w:t>…</w:t>
-            </w:r>
-          </w:p>
-        </w:tc>
-        <w:tc>
-          <w:tcPr>
-            <w:tcW w:w="2373" w:type="dxa"/>
+            <w:tcW w:w="1944" w:type="dxa"/>
+          </w:tcPr>
+          <w:p>
+            <w:r>
+              <w:t xml:space="preserve">- </w:t>
+            </w:r>
+            <w:r>
+              <w:rPr>
+                <w:color w:val="2F5496" w:themeColor="accent1" w:themeShade="BF"/>
+              </w:rPr>
+              <w:t>…</w:t>
+            </w:r>
+          </w:p>
+          <w:p>
+            <w:r>
+              <w:t xml:space="preserve">- </w:t>
+            </w:r>
+            <w:r>
+              <w:rPr>
+                <w:color w:val="2F5496" w:themeColor="accent1" w:themeShade="BF"/>
+              </w:rPr>
+              <w:t>…</w:t>
+            </w:r>
+          </w:p>
+          <w:p>
+            <w:r>
+              <w:t xml:space="preserve">- </w:t>
+            </w:r>
+            <w:r>
+              <w:rPr>
+                <w:color w:val="2F5496" w:themeColor="accent1" w:themeShade="BF"/>
+              </w:rPr>
+              <w:t>…</w:t>
+            </w:r>
+          </w:p>
+          <w:p>
+            <w:r>
+              <w:t xml:space="preserve">- </w:t>
+            </w:r>
+            <w:r>
+              <w:rPr>
+                <w:color w:val="2F5496" w:themeColor="accent1" w:themeShade="BF"/>
+              </w:rPr>
+              <w:t>…</w:t>
+            </w:r>
+          </w:p>
+        </w:tc>
+        <w:tc>
+          <w:tcPr>
+            <w:tcW w:w="2163" w:type="dxa"/>
           </w:tcPr>
           <w:p/>
         </w:tc>
         <w:tc>
           <w:tcPr>
-            <w:tcW w:w="2341" w:type="dxa"/>
+            <w:tcW w:w="2153" w:type="dxa"/>
           </w:tcPr>
           <w:p/>
         </w:tc>
         <w:tc>
           <w:tcPr>
-            <w:tcW w:w="2120" w:type="dxa"/>
+            <w:tcW w:w="1933" w:type="dxa"/>
           </w:tcPr>
           <w:p/>
         </w:tc>
@@ -1349,6 +1437,7 @@
         <w:rPr>
           <w:color w:val="000000" w:themeColor="text1"/>
         </w:rPr>
+        <w:lastRenderedPageBreak/>
         <w:t>Final reflection</w:t>
       </w:r>
       <w:r>
@@ -2205,6 +2294,7 @@
   <w:style w:type="character" w:default="1" w:styleId="DefaultParagraphFont">
     <w:name w:val="Default Paragraph Font"/>
     <w:uiPriority w:val="1"/>
+    <w:semiHidden/>
     <w:unhideWhenUsed/>
   </w:style>
   <w:style w:type="table" w:default="1" w:styleId="TableNormal">

</xml_diff>

<commit_message>
Revert "Merge branch 'main' into mark"
This reverts commit 3fdac5a33470d1efc1f836805f20a5b5ba06f6b2, reversing
changes made to c0a7de66220f0ac17df71abb4a5284d802aa97b6.
</commit_message>
<xml_diff>
--- a/Evaluation of Cooperation and usage of GenAI.docx
+++ b/Evaluation of Cooperation and usage of GenAI.docx
@@ -678,12 +678,12 @@
         <w:tblLook w:val="04A0" w:firstRow="1" w:lastRow="0" w:firstColumn="1" w:lastColumn="0" w:noHBand="0" w:noVBand="1"/>
       </w:tblPr>
       <w:tblGrid>
-        <w:gridCol w:w="1279"/>
-        <w:gridCol w:w="988"/>
-        <w:gridCol w:w="1944"/>
-        <w:gridCol w:w="2162"/>
-        <w:gridCol w:w="2152"/>
-        <w:gridCol w:w="1931"/>
+        <w:gridCol w:w="1278"/>
+        <w:gridCol w:w="1154"/>
+        <w:gridCol w:w="1363"/>
+        <w:gridCol w:w="2308"/>
+        <w:gridCol w:w="2287"/>
+        <w:gridCol w:w="2066"/>
       </w:tblGrid>
       <w:tr>
         <w:trPr>
@@ -691,7 +691,7 @@
         </w:trPr>
         <w:tc>
           <w:tcPr>
-            <w:tcW w:w="1279" w:type="dxa"/>
+            <w:tcW w:w="1018" w:type="dxa"/>
             <w:shd w:val="clear" w:color="auto" w:fill="D9E2F3" w:themeFill="accent1" w:themeFillTint="33"/>
           </w:tcPr>
           <w:p>
@@ -712,7 +712,7 @@
         </w:tc>
         <w:tc>
           <w:tcPr>
-            <w:tcW w:w="984" w:type="dxa"/>
+            <w:tcW w:w="1192" w:type="dxa"/>
             <w:shd w:val="clear" w:color="auto" w:fill="FFF2CC" w:themeFill="accent4" w:themeFillTint="33"/>
           </w:tcPr>
           <w:p>
@@ -733,7 +733,7 @@
         </w:tc>
         <w:tc>
           <w:tcPr>
-            <w:tcW w:w="1944" w:type="dxa"/>
+            <w:tcW w:w="1412" w:type="dxa"/>
             <w:shd w:val="clear" w:color="auto" w:fill="FFF2CC" w:themeFill="accent4" w:themeFillTint="33"/>
           </w:tcPr>
           <w:p>
@@ -768,7 +768,7 @@
         </w:tc>
         <w:tc>
           <w:tcPr>
-            <w:tcW w:w="2163" w:type="dxa"/>
+            <w:tcW w:w="2373" w:type="dxa"/>
             <w:shd w:val="clear" w:color="auto" w:fill="FFF2CC" w:themeFill="accent4" w:themeFillTint="33"/>
           </w:tcPr>
           <w:p>
@@ -789,7 +789,7 @@
         </w:tc>
         <w:tc>
           <w:tcPr>
-            <w:tcW w:w="2153" w:type="dxa"/>
+            <w:tcW w:w="2341" w:type="dxa"/>
             <w:shd w:val="clear" w:color="auto" w:fill="FFF2CC" w:themeFill="accent4" w:themeFillTint="33"/>
           </w:tcPr>
           <w:p>
@@ -823,7 +823,7 @@
         </w:tc>
         <w:tc>
           <w:tcPr>
-            <w:tcW w:w="1933" w:type="dxa"/>
+            <w:tcW w:w="2120" w:type="dxa"/>
             <w:shd w:val="clear" w:color="auto" w:fill="FFF2CC" w:themeFill="accent4" w:themeFillTint="33"/>
           </w:tcPr>
           <w:p>
@@ -854,7 +854,7 @@
         </w:trPr>
         <w:tc>
           <w:tcPr>
-            <w:tcW w:w="1279" w:type="dxa"/>
+            <w:tcW w:w="1018" w:type="dxa"/>
             <w:shd w:val="clear" w:color="auto" w:fill="E2EFD9" w:themeFill="accent6" w:themeFillTint="33"/>
             <w:vAlign w:val="center"/>
           </w:tcPr>
@@ -875,7 +875,7 @@
         </w:tc>
         <w:tc>
           <w:tcPr>
-            <w:tcW w:w="984" w:type="dxa"/>
+            <w:tcW w:w="1192" w:type="dxa"/>
             <w:vAlign w:val="center"/>
           </w:tcPr>
           <w:p>
@@ -891,56 +891,56 @@
         </w:tc>
         <w:tc>
           <w:tcPr>
-            <w:tcW w:w="1944" w:type="dxa"/>
-          </w:tcPr>
-          <w:p>
-            <w:r>
-              <w:t xml:space="preserve">- </w:t>
-            </w:r>
-            <w:r>
-              <w:rPr>
-                <w:color w:val="2F5496" w:themeColor="accent1" w:themeShade="BF"/>
-              </w:rPr>
-              <w:t>…</w:t>
-            </w:r>
-          </w:p>
-          <w:p>
-            <w:r>
-              <w:t xml:space="preserve">- </w:t>
-            </w:r>
-            <w:r>
-              <w:rPr>
-                <w:color w:val="2F5496" w:themeColor="accent1" w:themeShade="BF"/>
-              </w:rPr>
-              <w:t>…</w:t>
-            </w:r>
-          </w:p>
-          <w:p>
-            <w:r>
-              <w:t xml:space="preserve">- </w:t>
-            </w:r>
-            <w:r>
-              <w:rPr>
-                <w:color w:val="2F5496" w:themeColor="accent1" w:themeShade="BF"/>
-              </w:rPr>
-              <w:t>…</w:t>
-            </w:r>
-          </w:p>
-          <w:p>
-            <w:r>
-              <w:t xml:space="preserve">- </w:t>
-            </w:r>
-            <w:r>
-              <w:rPr>
-                <w:color w:val="2F5496" w:themeColor="accent1" w:themeShade="BF"/>
-              </w:rPr>
-              <w:t>…</w:t>
-            </w:r>
-          </w:p>
-        </w:tc>
-        <w:tc>
-          <w:tcPr>
-            <w:tcW w:w="2163" w:type="dxa"/>
+            <w:tcW w:w="1412" w:type="dxa"/>
+          </w:tcPr>
+          <w:p>
+            <w:r>
+              <w:t xml:space="preserve">- </w:t>
+            </w:r>
+            <w:r>
+              <w:rPr>
+                <w:color w:val="2F5496" w:themeColor="accent1" w:themeShade="BF"/>
+              </w:rPr>
+              <w:t>…</w:t>
+            </w:r>
+          </w:p>
+          <w:p>
+            <w:r>
+              <w:t xml:space="preserve">- </w:t>
+            </w:r>
+            <w:r>
+              <w:rPr>
+                <w:color w:val="2F5496" w:themeColor="accent1" w:themeShade="BF"/>
+              </w:rPr>
+              <w:t>…</w:t>
+            </w:r>
+          </w:p>
+          <w:p>
+            <w:r>
+              <w:t xml:space="preserve">- </w:t>
+            </w:r>
+            <w:r>
+              <w:rPr>
+                <w:color w:val="2F5496" w:themeColor="accent1" w:themeShade="BF"/>
+              </w:rPr>
+              <w:t>…</w:t>
+            </w:r>
+          </w:p>
+          <w:p>
+            <w:r>
+              <w:t xml:space="preserve">- </w:t>
+            </w:r>
+            <w:r>
+              <w:rPr>
+                <w:color w:val="2F5496" w:themeColor="accent1" w:themeShade="BF"/>
+              </w:rPr>
+              <w:t>…</w:t>
+            </w:r>
+          </w:p>
+        </w:tc>
+        <w:tc>
+          <w:tcPr>
+            <w:tcW w:w="2373" w:type="dxa"/>
           </w:tcPr>
           <w:p>
             <w:r>
@@ -988,7 +988,7 @@
         </w:tc>
         <w:tc>
           <w:tcPr>
-            <w:tcW w:w="2153" w:type="dxa"/>
+            <w:tcW w:w="2341" w:type="dxa"/>
           </w:tcPr>
           <w:p>
             <w:r>
@@ -1035,7 +1035,7 @@
         </w:tc>
         <w:tc>
           <w:tcPr>
-            <w:tcW w:w="1933" w:type="dxa"/>
+            <w:tcW w:w="2120" w:type="dxa"/>
           </w:tcPr>
           <w:p>
             <w:r>
@@ -1051,7 +1051,7 @@
         </w:trPr>
         <w:tc>
           <w:tcPr>
-            <w:tcW w:w="1279" w:type="dxa"/>
+            <w:tcW w:w="1018" w:type="dxa"/>
             <w:shd w:val="clear" w:color="auto" w:fill="E2EFD9" w:themeFill="accent6" w:themeFillTint="33"/>
             <w:vAlign w:val="center"/>
           </w:tcPr>
@@ -1059,155 +1059,85 @@
             <w:pPr>
               <w:jc w:val="center"/>
             </w:pPr>
-            <w:r>
-              <w:t>16/02/1026</w:t>
-            </w:r>
-          </w:p>
-        </w:tc>
-        <w:tc>
-          <w:tcPr>
-            <w:tcW w:w="984" w:type="dxa"/>
+          </w:p>
+        </w:tc>
+        <w:tc>
+          <w:tcPr>
+            <w:tcW w:w="1192" w:type="dxa"/>
             <w:vAlign w:val="center"/>
           </w:tcPr>
           <w:p>
             <w:pPr>
               <w:jc w:val="center"/>
             </w:pPr>
-            <w:r>
-              <w:t>ChatGPT</w:t>
-            </w:r>
-          </w:p>
-        </w:tc>
-        <w:tc>
-          <w:tcPr>
-            <w:tcW w:w="1944" w:type="dxa"/>
-          </w:tcPr>
-          <w:p>
-            <w:r>
-              <w:t>-</w:t>
-            </w:r>
-            <w:proofErr w:type="spellStart"/>
-            <w:r>
-              <w:t>filtered_df_genre</w:t>
-            </w:r>
-            <w:proofErr w:type="spellEnd"/>
-          </w:p>
-          <w:p>
-            <w:r>
-              <w:t>(part_1.py)</w:t>
-            </w:r>
-          </w:p>
-          <w:p>
-            <w:r>
-              <w:t xml:space="preserve">- </w:t>
-            </w:r>
-            <w:proofErr w:type="spellStart"/>
-            <w:r>
-              <w:t>similarity_check</w:t>
-            </w:r>
-            <w:proofErr w:type="spellEnd"/>
-          </w:p>
-          <w:p>
-            <w:r>
-              <w:t xml:space="preserve">- </w:t>
-            </w:r>
-            <w:r>
-              <w:rPr>
-                <w:color w:val="2F5496" w:themeColor="accent1" w:themeShade="BF"/>
-              </w:rPr>
-              <w:t>…</w:t>
-            </w:r>
-          </w:p>
-        </w:tc>
-        <w:tc>
-          <w:tcPr>
-            <w:tcW w:w="2163" w:type="dxa"/>
-          </w:tcPr>
-          <w:p>
-            <w:r>
-              <w:t xml:space="preserve">Asked for help with figuring out a way to check part of strings in a whole string; for revision of visualisation via </w:t>
-            </w:r>
-            <w:proofErr w:type="spellStart"/>
-            <w:r>
-              <w:t>mathplotlib</w:t>
-            </w:r>
-            <w:proofErr w:type="spellEnd"/>
-            <w:r>
-              <w:t xml:space="preserve">; for recommendations to check similar names upon and for help with the </w:t>
-            </w:r>
-            <w:r>
-              <w:t>formulation</w:t>
-            </w:r>
-            <w:r>
-              <w:t xml:space="preserve"> </w:t>
-            </w:r>
-            <w:r>
-              <w:t xml:space="preserve">of the names to </w:t>
-            </w:r>
-            <w:proofErr w:type="spellStart"/>
-            <w:r>
-              <w:t>chek</w:t>
-            </w:r>
-            <w:proofErr w:type="spellEnd"/>
-            <w:r>
-              <w:t>.</w:t>
-            </w:r>
-          </w:p>
-        </w:tc>
-        <w:tc>
-          <w:tcPr>
-            <w:tcW w:w="2153" w:type="dxa"/>
-          </w:tcPr>
-          <w:p>
-            <w:r>
-              <w:t xml:space="preserve">I was </w:t>
-            </w:r>
-            <w:proofErr w:type="spellStart"/>
-            <w:r>
-              <w:t>adviced</w:t>
-            </w:r>
-            <w:proofErr w:type="spellEnd"/>
-            <w:r>
-              <w:t xml:space="preserve"> on using </w:t>
-            </w:r>
-            <w:r>
-              <w:t>.</w:t>
-            </w:r>
-            <w:proofErr w:type="spellStart"/>
-            <w:proofErr w:type="gramStart"/>
-            <w:r>
-              <w:t>str.contains</w:t>
-            </w:r>
-            <w:proofErr w:type="spellEnd"/>
-            <w:proofErr w:type="gramEnd"/>
-            <w:r>
-              <w:t>,</w:t>
-            </w:r>
-            <w:r>
-              <w:t xml:space="preserve"> </w:t>
-            </w:r>
-            <w:r>
-              <w:t xml:space="preserve">and </w:t>
-            </w:r>
-            <w:proofErr w:type="spellStart"/>
-            <w:r>
-              <w:t>SequenceMatcher</w:t>
-            </w:r>
-            <w:proofErr w:type="spellEnd"/>
-            <w:r>
-              <w:t xml:space="preserve"> for name similarities and given basic usage of the method, which I used as a starting point.</w:t>
-            </w:r>
-          </w:p>
-        </w:tc>
-        <w:tc>
-          <w:tcPr>
-            <w:tcW w:w="1933" w:type="dxa"/>
-          </w:tcPr>
-          <w:p>
-            <w:r>
-              <w:t>I tried out my code and inspected myself.</w:t>
-            </w:r>
-          </w:p>
+          </w:p>
+        </w:tc>
+        <w:tc>
+          <w:tcPr>
+            <w:tcW w:w="1412" w:type="dxa"/>
+          </w:tcPr>
+          <w:p>
+            <w:r>
+              <w:t xml:space="preserve">- </w:t>
+            </w:r>
+            <w:r>
+              <w:rPr>
+                <w:color w:val="2F5496" w:themeColor="accent1" w:themeShade="BF"/>
+              </w:rPr>
+              <w:t>…</w:t>
+            </w:r>
+          </w:p>
+          <w:p>
+            <w:r>
+              <w:t xml:space="preserve">- </w:t>
+            </w:r>
+            <w:r>
+              <w:rPr>
+                <w:color w:val="2F5496" w:themeColor="accent1" w:themeShade="BF"/>
+              </w:rPr>
+              <w:t>…</w:t>
+            </w:r>
+          </w:p>
+          <w:p>
+            <w:r>
+              <w:t xml:space="preserve">- </w:t>
+            </w:r>
+            <w:r>
+              <w:rPr>
+                <w:color w:val="2F5496" w:themeColor="accent1" w:themeShade="BF"/>
+              </w:rPr>
+              <w:t>…</w:t>
+            </w:r>
+          </w:p>
+          <w:p>
+            <w:r>
+              <w:t xml:space="preserve">- </w:t>
+            </w:r>
+            <w:r>
+              <w:rPr>
+                <w:color w:val="2F5496" w:themeColor="accent1" w:themeShade="BF"/>
+              </w:rPr>
+              <w:t>…</w:t>
+            </w:r>
+          </w:p>
+        </w:tc>
+        <w:tc>
+          <w:tcPr>
+            <w:tcW w:w="2373" w:type="dxa"/>
+          </w:tcPr>
+          <w:p/>
+        </w:tc>
+        <w:tc>
+          <w:tcPr>
+            <w:tcW w:w="2341" w:type="dxa"/>
+          </w:tcPr>
+          <w:p/>
+        </w:tc>
+        <w:tc>
+          <w:tcPr>
+            <w:tcW w:w="2120" w:type="dxa"/>
+          </w:tcPr>
+          <w:p/>
         </w:tc>
       </w:tr>
       <w:tr>
@@ -1216,7 +1146,7 @@
         </w:trPr>
         <w:tc>
           <w:tcPr>
-            <w:tcW w:w="1279" w:type="dxa"/>
+            <w:tcW w:w="1018" w:type="dxa"/>
             <w:shd w:val="clear" w:color="auto" w:fill="E2EFD9" w:themeFill="accent6" w:themeFillTint="33"/>
             <w:vAlign w:val="center"/>
           </w:tcPr>
@@ -1224,103 +1154,85 @@
             <w:pPr>
               <w:jc w:val="center"/>
             </w:pPr>
-            <w:r>
-              <w:t>20/02/2026</w:t>
-            </w:r>
-          </w:p>
-        </w:tc>
-        <w:tc>
-          <w:tcPr>
-            <w:tcW w:w="984" w:type="dxa"/>
+          </w:p>
+        </w:tc>
+        <w:tc>
+          <w:tcPr>
+            <w:tcW w:w="1192" w:type="dxa"/>
             <w:vAlign w:val="center"/>
           </w:tcPr>
           <w:p>
             <w:pPr>
               <w:jc w:val="center"/>
             </w:pPr>
-            <w:r>
-              <w:t>ChatGPT</w:t>
-            </w:r>
-          </w:p>
-        </w:tc>
-        <w:tc>
-          <w:tcPr>
-            <w:tcW w:w="1944" w:type="dxa"/>
-          </w:tcPr>
-          <w:p>
-            <w:r>
-              <w:t xml:space="preserve">- </w:t>
-            </w:r>
-            <w:r>
-              <w:t>part_3.py</w:t>
-            </w:r>
-          </w:p>
-          <w:p>
-            <w:r>
-              <w:t xml:space="preserve">- </w:t>
-            </w:r>
-            <w:r>
-              <w:rPr>
-                <w:color w:val="2F5496" w:themeColor="accent1" w:themeShade="BF"/>
-              </w:rPr>
-              <w:t>…</w:t>
-            </w:r>
-          </w:p>
-          <w:p>
-            <w:r>
-              <w:t xml:space="preserve">- </w:t>
-            </w:r>
-            <w:r>
-              <w:rPr>
-                <w:color w:val="2F5496" w:themeColor="accent1" w:themeShade="BF"/>
-              </w:rPr>
-              <w:t>…</w:t>
-            </w:r>
-          </w:p>
-          <w:p>
-            <w:r>
-              <w:t xml:space="preserve">- </w:t>
-            </w:r>
-            <w:r>
-              <w:rPr>
-                <w:color w:val="2F5496" w:themeColor="accent1" w:themeShade="BF"/>
-              </w:rPr>
-              <w:t>…</w:t>
-            </w:r>
-          </w:p>
-        </w:tc>
-        <w:tc>
-          <w:tcPr>
-            <w:tcW w:w="2163" w:type="dxa"/>
-          </w:tcPr>
-          <w:p>
-            <w:r>
-              <w:t xml:space="preserve">I asked </w:t>
-            </w:r>
-            <w:r>
-              <w:t>about revising and improving SQLite database structure and queries — including adjusting primary and foreign keys, inspecting constraints, refining JOIN logic and related SQL statements, and understanding when to perform data processing in SQL versus Python for better performance.</w:t>
-            </w:r>
-          </w:p>
-        </w:tc>
-        <w:tc>
-          <w:tcPr>
-            <w:tcW w:w="2153" w:type="dxa"/>
-          </w:tcPr>
-          <w:p>
-            <w:r>
-              <w:t xml:space="preserve">I used most output as a refreshment for the mobility and functionality of data bases. </w:t>
-            </w:r>
-          </w:p>
-        </w:tc>
-        <w:tc>
-          <w:tcPr>
-            <w:tcW w:w="1933" w:type="dxa"/>
-          </w:tcPr>
-          <w:p>
-            <w:r>
-              <w:t>I compared with notes from my previous databases courses and by inspecting the code myself.</w:t>
-            </w:r>
-          </w:p>
+          </w:p>
+        </w:tc>
+        <w:tc>
+          <w:tcPr>
+            <w:tcW w:w="1412" w:type="dxa"/>
+          </w:tcPr>
+          <w:p>
+            <w:r>
+              <w:t xml:space="preserve">- </w:t>
+            </w:r>
+            <w:r>
+              <w:rPr>
+                <w:color w:val="2F5496" w:themeColor="accent1" w:themeShade="BF"/>
+              </w:rPr>
+              <w:t>…</w:t>
+            </w:r>
+          </w:p>
+          <w:p>
+            <w:r>
+              <w:t xml:space="preserve">- </w:t>
+            </w:r>
+            <w:r>
+              <w:rPr>
+                <w:color w:val="2F5496" w:themeColor="accent1" w:themeShade="BF"/>
+              </w:rPr>
+              <w:t>…</w:t>
+            </w:r>
+          </w:p>
+          <w:p>
+            <w:r>
+              <w:t xml:space="preserve">- </w:t>
+            </w:r>
+            <w:r>
+              <w:rPr>
+                <w:color w:val="2F5496" w:themeColor="accent1" w:themeShade="BF"/>
+              </w:rPr>
+              <w:t>…</w:t>
+            </w:r>
+          </w:p>
+          <w:p>
+            <w:r>
+              <w:t xml:space="preserve">- </w:t>
+            </w:r>
+            <w:r>
+              <w:rPr>
+                <w:color w:val="2F5496" w:themeColor="accent1" w:themeShade="BF"/>
+              </w:rPr>
+              <w:t>…</w:t>
+            </w:r>
+          </w:p>
+        </w:tc>
+        <w:tc>
+          <w:tcPr>
+            <w:tcW w:w="2373" w:type="dxa"/>
+          </w:tcPr>
+          <w:p/>
+        </w:tc>
+        <w:tc>
+          <w:tcPr>
+            <w:tcW w:w="2341" w:type="dxa"/>
+          </w:tcPr>
+          <w:p/>
+        </w:tc>
+        <w:tc>
+          <w:tcPr>
+            <w:tcW w:w="2120" w:type="dxa"/>
+          </w:tcPr>
+          <w:p/>
         </w:tc>
       </w:tr>
       <w:tr>
@@ -1329,7 +1241,7 @@
         </w:trPr>
         <w:tc>
           <w:tcPr>
-            <w:tcW w:w="1279" w:type="dxa"/>
+            <w:tcW w:w="1018" w:type="dxa"/>
             <w:shd w:val="clear" w:color="auto" w:fill="E2EFD9" w:themeFill="accent6" w:themeFillTint="33"/>
             <w:vAlign w:val="center"/>
           </w:tcPr>
@@ -1344,7 +1256,7 @@
         </w:tc>
         <w:tc>
           <w:tcPr>
-            <w:tcW w:w="984" w:type="dxa"/>
+            <w:tcW w:w="1192" w:type="dxa"/>
             <w:vAlign w:val="center"/>
           </w:tcPr>
           <w:p>
@@ -1358,68 +1270,68 @@
         </w:tc>
         <w:tc>
           <w:tcPr>
-            <w:tcW w:w="1944" w:type="dxa"/>
-          </w:tcPr>
-          <w:p>
-            <w:r>
-              <w:t xml:space="preserve">- </w:t>
-            </w:r>
-            <w:r>
-              <w:rPr>
-                <w:color w:val="2F5496" w:themeColor="accent1" w:themeShade="BF"/>
-              </w:rPr>
-              <w:t>…</w:t>
-            </w:r>
-          </w:p>
-          <w:p>
-            <w:r>
-              <w:t xml:space="preserve">- </w:t>
-            </w:r>
-            <w:r>
-              <w:rPr>
-                <w:color w:val="2F5496" w:themeColor="accent1" w:themeShade="BF"/>
-              </w:rPr>
-              <w:t>…</w:t>
-            </w:r>
-          </w:p>
-          <w:p>
-            <w:r>
-              <w:t xml:space="preserve">- </w:t>
-            </w:r>
-            <w:r>
-              <w:rPr>
-                <w:color w:val="2F5496" w:themeColor="accent1" w:themeShade="BF"/>
-              </w:rPr>
-              <w:t>…</w:t>
-            </w:r>
-          </w:p>
-          <w:p>
-            <w:r>
-              <w:t xml:space="preserve">- </w:t>
-            </w:r>
-            <w:r>
-              <w:rPr>
-                <w:color w:val="2F5496" w:themeColor="accent1" w:themeShade="BF"/>
-              </w:rPr>
-              <w:t>…</w:t>
-            </w:r>
-          </w:p>
-        </w:tc>
-        <w:tc>
-          <w:tcPr>
-            <w:tcW w:w="2163" w:type="dxa"/>
+            <w:tcW w:w="1412" w:type="dxa"/>
+          </w:tcPr>
+          <w:p>
+            <w:r>
+              <w:t xml:space="preserve">- </w:t>
+            </w:r>
+            <w:r>
+              <w:rPr>
+                <w:color w:val="2F5496" w:themeColor="accent1" w:themeShade="BF"/>
+              </w:rPr>
+              <w:t>…</w:t>
+            </w:r>
+          </w:p>
+          <w:p>
+            <w:r>
+              <w:t xml:space="preserve">- </w:t>
+            </w:r>
+            <w:r>
+              <w:rPr>
+                <w:color w:val="2F5496" w:themeColor="accent1" w:themeShade="BF"/>
+              </w:rPr>
+              <w:t>…</w:t>
+            </w:r>
+          </w:p>
+          <w:p>
+            <w:r>
+              <w:t xml:space="preserve">- </w:t>
+            </w:r>
+            <w:r>
+              <w:rPr>
+                <w:color w:val="2F5496" w:themeColor="accent1" w:themeShade="BF"/>
+              </w:rPr>
+              <w:t>…</w:t>
+            </w:r>
+          </w:p>
+          <w:p>
+            <w:r>
+              <w:t xml:space="preserve">- </w:t>
+            </w:r>
+            <w:r>
+              <w:rPr>
+                <w:color w:val="2F5496" w:themeColor="accent1" w:themeShade="BF"/>
+              </w:rPr>
+              <w:t>…</w:t>
+            </w:r>
+          </w:p>
+        </w:tc>
+        <w:tc>
+          <w:tcPr>
+            <w:tcW w:w="2373" w:type="dxa"/>
           </w:tcPr>
           <w:p/>
         </w:tc>
         <w:tc>
           <w:tcPr>
-            <w:tcW w:w="2153" w:type="dxa"/>
+            <w:tcW w:w="2341" w:type="dxa"/>
           </w:tcPr>
           <w:p/>
         </w:tc>
         <w:tc>
           <w:tcPr>
-            <w:tcW w:w="1933" w:type="dxa"/>
+            <w:tcW w:w="2120" w:type="dxa"/>
           </w:tcPr>
           <w:p/>
         </w:tc>
@@ -1437,7 +1349,6 @@
         <w:rPr>
           <w:color w:val="000000" w:themeColor="text1"/>
         </w:rPr>
-        <w:lastRenderedPageBreak/>
         <w:t>Final reflection</w:t>
       </w:r>
       <w:r>
@@ -2294,7 +2205,6 @@
   <w:style w:type="character" w:default="1" w:styleId="DefaultParagraphFont">
     <w:name w:val="Default Paragraph Font"/>
     <w:uiPriority w:val="1"/>
-    <w:semiHidden/>
     <w:unhideWhenUsed/>
   </w:style>
   <w:style w:type="table" w:default="1" w:styleId="TableNormal">

</xml_diff>